<commit_message>
update 2nd testchip plan
</commit_message>
<xml_diff>
--- a/output/KW_Memory_Compiler_SOW_20260730.docx
+++ b/output/KW_Memory_Compiler_SOW_20260730.docx
@@ -6432,7 +6432,7 @@
     </w:tbl>
     <w:bookmarkEnd w:id="42"/>
     <w:bookmarkEnd w:id="43"/>
-    <w:bookmarkStart w:id="54" w:name="第二章-memory-compiler-测试片规格定义"/>
+    <w:bookmarkStart w:id="66" w:name="第二章-memory-compiler-测试片规格定义"/>
     <w:p>
       <w:pPr>
         <w:pStyle w:val="2"/>
@@ -6464,7 +6464,7 @@
         <w:rPr>
           <w:rFonts w:hint="eastAsia"/>
         </w:rPr>
-        <w:t xml:space="preserve">Compiler测试片计划从2026年7月20日正式启动，最终交付时间约为2026年11月30日。测试片覆盖第一章所述4套Memory</w:t>
+        <w:t xml:space="preserve">Compiler测试片计划共计两个阶段：第一阶段从2026年7月20日正式启动，最终交付时间约为2026年11月30日，测试片覆盖第一章所述4套Memory</w:t>
       </w:r>
       <w:r>
         <w:t xml:space="preserve"> </w:t>
@@ -6473,10 +6473,19 @@
         <w:rPr>
           <w:rFonts w:hint="eastAsia"/>
         </w:rPr>
-        <w:t xml:space="preserve">Compiler的验证需求。</w:t>
+        <w:t xml:space="preserve">Compiler的部分验证需求；第二阶段从2026年12月1日正式启动，最终预计交付时间为2027年6月30日，测试片覆盖第一章所述4套Memory</w:t>
+      </w:r>
+      <w:r>
+        <w:t xml:space="preserve"> </w:t>
+      </w:r>
+      <w:r>
+        <w:rPr>
+          <w:rFonts w:hint="eastAsia"/>
+        </w:rPr>
+        <w:t xml:space="preserve">Compiler的全部验证需求。</w:t>
       </w:r>
     </w:p>
-    <w:bookmarkStart w:id="51" w:name="测试片规格"/>
+    <w:bookmarkStart w:id="52" w:name="第一阶段测试片规格"/>
     <w:p>
       <w:pPr>
         <w:pStyle w:val="3"/>
@@ -6488,7 +6497,7 @@
         <w:rPr>
           <w:rFonts w:hint="eastAsia"/>
         </w:rPr>
-        <w:t xml:space="preserve">测试片规格</w:t>
+        <w:t xml:space="preserve">第一阶段测试片规格</w:t>
       </w:r>
     </w:p>
     <w:p>
@@ -6499,7 +6508,34 @@
         <w:rPr>
           <w:rFonts w:hint="eastAsia"/>
         </w:rPr>
-        <w:t xml:space="preserve">测试片采用FT测试，使用ATE测试设备对封装后芯片进行测试。测试片规格信息如下：</w:t>
+        <w:t xml:space="preserve">第一阶段测试片支持部分自研memory</w:t>
+      </w:r>
+      <w:r>
+        <w:t xml:space="preserve"> </w:t>
+      </w:r>
+      <w:r>
+        <w:rPr>
+          <w:rFonts w:hint="eastAsia"/>
+        </w:rPr>
+        <w:t xml:space="preserve">list和三方memory</w:t>
+      </w:r>
+      <w:r>
+        <w:t xml:space="preserve"> </w:t>
+      </w:r>
+      <w:r>
+        <w:rPr>
+          <w:rFonts w:hint="eastAsia"/>
+        </w:rPr>
+        <w:t xml:space="preserve">list的验证，详情请参见《KWS9_TestChip_list_20260705》。</w:t>
+      </w:r>
+      <w:r>
+        <w:t xml:space="preserve"> </w:t>
+      </w:r>
+      <w:r>
+        <w:rPr>
+          <w:rFonts w:hint="eastAsia"/>
+        </w:rPr>
+        <w:t xml:space="preserve">第一阶段测试片采用FT测试，使用ATE测试设备对封装后芯片进行测试。测试片规格信息如下：</w:t>
       </w:r>
     </w:p>
     <w:p>
@@ -6527,7 +6563,7 @@
           <w:b/>
           <w:bCs/>
         </w:rPr>
-        <w:t xml:space="preserve">测试片信息</w:t>
+        <w:t xml:space="preserve">第一阶段测试片信息</w:t>
       </w:r>
     </w:p>
     <w:tbl>
@@ -6536,7 +6572,7 @@
         <w:tblW w:type="pct" w:w="2361"/>
         <w:tblLayout w:type="fixed"/>
         <w:tblLook w:firstRow="1" w:lastRow="0" w:firstColumn="0" w:lastColumn="0" w:noHBand="0" w:noVBand="0" w:val="0020"/>
-        <w:tblCaption w:val="表 2-1 测试片信息"/>
+        <w:tblCaption w:val="表 2-1 第一阶段测试片信息"/>
       </w:tblPr>
       <w:tblGrid>
         <w:gridCol w:w="1980"/>
@@ -6666,24 +6702,39 @@
         </w:tc>
       </w:tr>
     </w:tbl>
+    <w:bookmarkStart w:id="49" w:name="第一阶段测试片测试方案"/>
     <w:p>
       <w:pPr>
-        <w:pStyle w:val="BodyText"/>
-      </w:pPr>
-      <w:r>
-        <w:rPr>
-          <w:rFonts w:hint="eastAsia"/>
-        </w:rPr>
-        <w:t xml:space="preserve">测试片拟支持多种测试方案：</w:t>
+        <w:pStyle w:val="4"/>
+      </w:pPr>
+      <w:r>
+        <w:t xml:space="preserve">2.1.1 </w:t>
+      </w:r>
+      <w:r>
+        <w:rPr>
+          <w:rFonts w:hint="eastAsia"/>
+        </w:rPr>
+        <w:t xml:space="preserve">第一阶段测试片测试方案</w:t>
+      </w:r>
+    </w:p>
+    <w:p>
+      <w:pPr>
+        <w:pStyle w:val="FirstParagraph"/>
+      </w:pPr>
+      <w:r>
+        <w:rPr>
+          <w:rFonts w:hint="eastAsia"/>
+        </w:rPr>
+        <w:t xml:space="preserve">第一阶段测试片支持以下测试方案：</w:t>
       </w:r>
     </w:p>
     <w:bookmarkStart w:id="44" w:name="memory功能测试"/>
     <w:p>
       <w:pPr>
-        <w:pStyle w:val="4"/>
-      </w:pPr>
-      <w:r>
-        <w:t xml:space="preserve">2.1.1 </w:t>
+        <w:pStyle w:val="5"/>
+      </w:pPr>
+      <w:r>
+        <w:t xml:space="preserve">2.1.1.1 </w:t>
       </w:r>
       <w:r>
         <w:rPr>
@@ -6707,10 +6758,10 @@
     <w:bookmarkStart w:id="45" w:name="功耗测试"/>
     <w:p>
       <w:pPr>
-        <w:pStyle w:val="4"/>
-      </w:pPr>
-      <w:r>
-        <w:t xml:space="preserve">2.1.2 </w:t>
+        <w:pStyle w:val="5"/>
+      </w:pPr>
+      <w:r>
+        <w:t xml:space="preserve">2.1.1.2 </w:t>
       </w:r>
       <w:r>
         <w:rPr>
@@ -6734,10 +6785,10 @@
     <w:bookmarkStart w:id="46" w:name="最高最低工作电压测试"/>
     <w:p>
       <w:pPr>
-        <w:pStyle w:val="4"/>
-      </w:pPr>
-      <w:r>
-        <w:t xml:space="preserve">2.1.3 </w:t>
+        <w:pStyle w:val="5"/>
+      </w:pPr>
+      <w:r>
+        <w:t xml:space="preserve">2.1.1.3 </w:t>
       </w:r>
       <w:r>
         <w:rPr>
@@ -6761,10 +6812,10 @@
     <w:bookmarkStart w:id="47" w:name="retention测试"/>
     <w:p>
       <w:pPr>
-        <w:pStyle w:val="4"/>
-      </w:pPr>
-      <w:r>
-        <w:t xml:space="preserve">2.1.4 </w:t>
+        <w:pStyle w:val="5"/>
+      </w:pPr>
+      <w:r>
+        <w:t xml:space="preserve">2.1.1.4 </w:t>
       </w:r>
       <w:r>
         <w:rPr>
@@ -6788,10 +6839,10 @@
     <w:bookmarkStart w:id="48" w:name="htol测试"/>
     <w:p>
       <w:pPr>
-        <w:pStyle w:val="4"/>
-      </w:pPr>
-      <w:r>
-        <w:t xml:space="preserve">2.1.5 </w:t>
+        <w:pStyle w:val="5"/>
+      </w:pPr>
+      <w:r>
+        <w:t xml:space="preserve">2.1.1.5 </w:t>
       </w:r>
       <w:r>
         <w:rPr>
@@ -6812,78 +6863,24 @@
       </w:r>
     </w:p>
     <w:bookmarkEnd w:id="48"/>
-    <w:bookmarkStart w:id="49" w:name="冗余功能测试"/>
+    <w:bookmarkEnd w:id="49"/>
+    <w:bookmarkStart w:id="50" w:name="第一阶段测试片开发计划"/>
     <w:p>
       <w:pPr>
         <w:pStyle w:val="4"/>
       </w:pPr>
       <w:r>
-        <w:t xml:space="preserve">2.1.6 </w:t>
-      </w:r>
-      <w:r>
-        <w:rPr>
-          <w:rFonts w:hint="eastAsia"/>
-        </w:rPr>
-        <w:t xml:space="preserve">冗余功能测试</w:t>
+        <w:t xml:space="preserve">2.1.2 </w:t>
+      </w:r>
+      <w:r>
+        <w:rPr>
+          <w:rFonts w:hint="eastAsia"/>
+        </w:rPr>
+        <w:t xml:space="preserve">第一阶段测试片开发计划</w:t>
       </w:r>
     </w:p>
     <w:p>
       <w:pPr>
-        <w:pStyle w:val="FirstParagraph"/>
-      </w:pPr>
-      <w:r>
-        <w:rPr>
-          <w:rFonts w:hint="eastAsia"/>
-        </w:rPr>
-        <w:t xml:space="preserve">测试片支持对冗余功能的Memory实例进行功能验证，测试片支持解析后的冗余配置信息对Memory实例的冗余DFF链进行配置，从而实现冗余替换功能。</w:t>
-      </w:r>
-    </w:p>
-    <w:bookmarkEnd w:id="49"/>
-    <w:bookmarkStart w:id="50" w:name="ecc功能测试"/>
-    <w:p>
-      <w:pPr>
-        <w:pStyle w:val="4"/>
-      </w:pPr>
-      <w:r>
-        <w:t xml:space="preserve">2.1.7 </w:t>
-      </w:r>
-      <w:r>
-        <w:rPr>
-          <w:rFonts w:hint="eastAsia"/>
-        </w:rPr>
-        <w:t xml:space="preserve">ECC功能测试</w:t>
-      </w:r>
-    </w:p>
-    <w:p>
-      <w:pPr>
-        <w:pStyle w:val="FirstParagraph"/>
-      </w:pPr>
-      <w:r>
-        <w:rPr>
-          <w:rFonts w:hint="eastAsia"/>
-        </w:rPr>
-        <w:t xml:space="preserve">测试片支持对SRAM的ECC功能进行验证，使用提供的实现ECC功能的RTL代码进行综合，并支持外部向量置错场景下的一位纠错以及两位检错的功能验证。</w:t>
-      </w:r>
-    </w:p>
-    <w:bookmarkEnd w:id="50"/>
-    <w:bookmarkEnd w:id="51"/>
-    <w:bookmarkStart w:id="52" w:name="测试片开发计划"/>
-    <w:p>
-      <w:pPr>
-        <w:pStyle w:val="3"/>
-      </w:pPr>
-      <w:r>
-        <w:t xml:space="preserve">2.2 </w:t>
-      </w:r>
-      <w:r>
-        <w:rPr>
-          <w:rFonts w:hint="eastAsia"/>
-        </w:rPr>
-        <w:t xml:space="preserve">测试片开发计划</w:t>
-      </w:r>
-    </w:p>
-    <w:p>
-      <w:pPr>
         <w:pStyle w:val="TableCaption"/>
       </w:pPr>
       <w:r>
@@ -6907,7 +6904,7 @@
           <w:b/>
           <w:bCs/>
         </w:rPr>
-        <w:t xml:space="preserve">测试片开发计划</w:t>
+        <w:t xml:space="preserve">第一阶段测试片开发计划</w:t>
       </w:r>
     </w:p>
     <w:tbl>
@@ -6916,7 +6913,7 @@
         <w:tblW w:type="pct" w:w="4867"/>
         <w:tblLayout w:type="fixed"/>
         <w:tblLook w:firstRow="1" w:lastRow="0" w:firstColumn="0" w:lastColumn="0" w:noHBand="0" w:noVBand="0" w:val="0020"/>
-        <w:tblCaption w:val="表 2-2 测试片开发计划"/>
+        <w:tblCaption w:val="表 2-2 第一阶段测试片开发计划"/>
       </w:tblPr>
       <w:tblGrid>
         <w:gridCol w:w="1056"/>
@@ -7388,20 +7385,20 @@
         </w:tc>
       </w:tr>
     </w:tbl>
-    <w:bookmarkEnd w:id="52"/>
-    <w:bookmarkStart w:id="53" w:name="封装测试计划"/>
+    <w:bookmarkEnd w:id="50"/>
+    <w:bookmarkStart w:id="51" w:name="第一阶段封装测试计划"/>
     <w:p>
       <w:pPr>
-        <w:pStyle w:val="3"/>
-      </w:pPr>
-      <w:r>
-        <w:t xml:space="preserve">2.3 </w:t>
-      </w:r>
-      <w:r>
-        <w:rPr>
-          <w:rFonts w:hint="eastAsia"/>
-        </w:rPr>
-        <w:t xml:space="preserve">封装测试计划</w:t>
+        <w:pStyle w:val="4"/>
+      </w:pPr>
+      <w:r>
+        <w:t xml:space="preserve">2.1.3 </w:t>
+      </w:r>
+      <w:r>
+        <w:rPr>
+          <w:rFonts w:hint="eastAsia"/>
+        </w:rPr>
+        <w:t xml:space="preserve">第一阶段封装测试计划</w:t>
       </w:r>
     </w:p>
     <w:p>
@@ -7429,7 +7426,7 @@
           <w:b/>
           <w:bCs/>
         </w:rPr>
-        <w:t xml:space="preserve">封装测试计划</w:t>
+        <w:t xml:space="preserve">第一阶段封装测试计划</w:t>
       </w:r>
     </w:p>
     <w:tbl>
@@ -7438,7 +7435,7 @@
         <w:tblW w:type="pct" w:w="3125"/>
         <w:tblLayout w:type="fixed"/>
         <w:tblLook w:firstRow="1" w:lastRow="0" w:firstColumn="0" w:lastColumn="0" w:noHBand="0" w:noVBand="0" w:val="0020"/>
-        <w:tblCaption w:val="表 2-3 封装测试计划"/>
+        <w:tblCaption w:val="表 2-3 第一阶段封装测试计划"/>
       </w:tblPr>
       <w:tblGrid>
         <w:gridCol w:w="1100"/>
@@ -7671,8 +7668,1322 @@
         </w:tc>
       </w:tr>
     </w:tbl>
+    <w:p>
+      <w:pPr>
+        <w:pStyle w:val="BodyText"/>
+      </w:pPr>
+      <w:r>
+        <w:rPr>
+          <w:rFonts w:hint="eastAsia"/>
+        </w:rPr>
+        <w:t xml:space="preserve">详情请参见《KWS9_Test_Plan_20260801》。</w:t>
+      </w:r>
+    </w:p>
+    <w:bookmarkEnd w:id="51"/>
+    <w:bookmarkEnd w:id="52"/>
+    <w:bookmarkStart w:id="65" w:name="第二阶段测试片规格"/>
+    <w:p>
+      <w:pPr>
+        <w:pStyle w:val="3"/>
+      </w:pPr>
+      <w:r>
+        <w:t xml:space="preserve">2.2 </w:t>
+      </w:r>
+      <w:r>
+        <w:rPr>
+          <w:rFonts w:hint="eastAsia"/>
+        </w:rPr>
+        <w:t xml:space="preserve">第二阶段测试片规格</w:t>
+      </w:r>
+    </w:p>
+    <w:p>
+      <w:pPr>
+        <w:pStyle w:val="FirstParagraph"/>
+      </w:pPr>
+      <w:r>
+        <w:rPr>
+          <w:rFonts w:hint="eastAsia"/>
+        </w:rPr>
+        <w:t xml:space="preserve">第二阶段测试片采用FT测试，使用ATE测试设备对封装后芯片进行测试。测试片规格信息如下：</w:t>
+      </w:r>
+    </w:p>
+    <w:p>
+      <w:pPr>
+        <w:pStyle w:val="TableCaption"/>
+      </w:pPr>
+      <w:r>
+        <w:rPr>
+          <w:rFonts w:hint="eastAsia"/>
+          <w:b/>
+          <w:bCs/>
+        </w:rPr>
+        <w:t xml:space="preserve">表</w:t>
+      </w:r>
+      <w:r>
+        <w:rPr>
+          <w:b/>
+          <w:bCs/>
+        </w:rPr>
+        <w:t xml:space="preserve"> 2-4 </w:t>
+      </w:r>
+      <w:r>
+        <w:rPr>
+          <w:rFonts w:hint="eastAsia"/>
+          <w:b/>
+          <w:bCs/>
+        </w:rPr>
+        <w:t xml:space="preserve">第二阶段测试片信息</w:t>
+      </w:r>
+    </w:p>
+    <w:tbl>
+      <w:tblPr>
+        <w:tblStyle w:val="Table"/>
+        <w:tblW w:type="pct" w:w="2361"/>
+        <w:tblLayout w:type="fixed"/>
+        <w:tblLook w:firstRow="1" w:lastRow="0" w:firstColumn="0" w:lastColumn="0" w:noHBand="0" w:noVBand="0" w:val="0020"/>
+        <w:tblCaption w:val="表 2-4 第二阶段测试片信息"/>
+      </w:tblPr>
+      <w:tblGrid>
+        <w:gridCol w:w="1980"/>
+        <w:gridCol w:w="1760"/>
+      </w:tblGrid>
+      <w:tr>
+        <w:trPr>
+          <w:tblHeader w:val="on"/>
+        </w:trPr>
+        <w:tc>
+          <w:tcPr/>
+          <w:p>
+            <w:pPr>
+              <w:pStyle w:val="Compact"/>
+            </w:pPr>
+            <w:r>
+              <w:t xml:space="preserve">Testchip Code</w:t>
+            </w:r>
+          </w:p>
+        </w:tc>
+        <w:tc>
+          <w:tcPr/>
+          <w:p>
+            <w:pPr>
+              <w:pStyle w:val="Compact"/>
+            </w:pPr>
+            <w:r>
+              <w:t xml:space="preserve">KWS11</w:t>
+            </w:r>
+          </w:p>
+        </w:tc>
+      </w:tr>
+      <w:tr>
+        <w:tc>
+          <w:tcPr/>
+          <w:p>
+            <w:pPr>
+              <w:pStyle w:val="Compact"/>
+            </w:pPr>
+            <w:r>
+              <w:t xml:space="preserve">PDK Version</w:t>
+            </w:r>
+          </w:p>
+        </w:tc>
+        <w:tc>
+          <w:tcPr/>
+          <w:p>
+            <w:pPr>
+              <w:pStyle w:val="Compact"/>
+            </w:pPr>
+            <w:r>
+              <w:t xml:space="preserve">SOI 22nm(TBD)</w:t>
+            </w:r>
+          </w:p>
+        </w:tc>
+      </w:tr>
+      <w:tr>
+        <w:tc>
+          <w:tcPr/>
+          <w:p>
+            <w:pPr>
+              <w:pStyle w:val="Compact"/>
+            </w:pPr>
+            <w:r>
+              <w:t xml:space="preserve">Metal Stack</w:t>
+            </w:r>
+          </w:p>
+        </w:tc>
+        <w:tc>
+          <w:tcPr/>
+          <w:p>
+            <w:pPr>
+              <w:pStyle w:val="Compact"/>
+            </w:pPr>
+            <w:r>
+              <w:t xml:space="preserve">1P8M(TBD)</w:t>
+            </w:r>
+          </w:p>
+        </w:tc>
+      </w:tr>
+      <w:tr>
+        <w:tc>
+          <w:tcPr/>
+          <w:p>
+            <w:pPr>
+              <w:pStyle w:val="Compact"/>
+            </w:pPr>
+            <w:r>
+              <w:t xml:space="preserve">Package</w:t>
+            </w:r>
+          </w:p>
+        </w:tc>
+        <w:tc>
+          <w:tcPr/>
+          <w:p>
+            <w:pPr>
+              <w:pStyle w:val="Compact"/>
+            </w:pPr>
+            <w:r>
+              <w:t xml:space="preserve">TFBGA(TBD)</w:t>
+            </w:r>
+          </w:p>
+        </w:tc>
+      </w:tr>
+      <w:tr>
+        <w:tc>
+          <w:tcPr/>
+          <w:p>
+            <w:pPr>
+              <w:pStyle w:val="Compact"/>
+            </w:pPr>
+            <w:r>
+              <w:t xml:space="preserve">Size</w:t>
+            </w:r>
+          </w:p>
+        </w:tc>
+        <w:tc>
+          <w:tcPr/>
+          <w:p>
+            <w:pPr>
+              <w:pStyle w:val="Compact"/>
+            </w:pPr>
+            <w:r>
+              <w:t xml:space="preserve">~5mm*5mm(TBD)</w:t>
+            </w:r>
+          </w:p>
+        </w:tc>
+      </w:tr>
+    </w:tbl>
+    <w:bookmarkStart w:id="62" w:name="第二阶段测试片测试方案"/>
+    <w:p>
+      <w:pPr>
+        <w:pStyle w:val="4"/>
+      </w:pPr>
+      <w:r>
+        <w:t xml:space="preserve">2.2.1 </w:t>
+      </w:r>
+      <w:r>
+        <w:rPr>
+          <w:rFonts w:hint="eastAsia"/>
+        </w:rPr>
+        <w:t xml:space="preserve">第二阶段测试片测试方案</w:t>
+      </w:r>
+    </w:p>
+    <w:p>
+      <w:pPr>
+        <w:pStyle w:val="FirstParagraph"/>
+      </w:pPr>
+      <w:r>
+        <w:rPr>
+          <w:rFonts w:hint="eastAsia"/>
+        </w:rPr>
+        <w:t xml:space="preserve">第一阶段测试片支持以下测试方案：</w:t>
+      </w:r>
+    </w:p>
+    <w:bookmarkStart w:id="53" w:name="memory功能测试-1"/>
+    <w:p>
+      <w:pPr>
+        <w:pStyle w:val="5"/>
+      </w:pPr>
+      <w:r>
+        <w:t xml:space="preserve">2.2.1.1 </w:t>
+      </w:r>
+      <w:r>
+        <w:rPr>
+          <w:rFonts w:hint="eastAsia"/>
+        </w:rPr>
+        <w:t xml:space="preserve">Memory功能测试</w:t>
+      </w:r>
+    </w:p>
+    <w:p>
+      <w:pPr>
+        <w:pStyle w:val="FirstParagraph"/>
+      </w:pPr>
+      <w:r>
+        <w:rPr>
+          <w:rFonts w:hint="eastAsia"/>
+        </w:rPr>
+        <w:t xml:space="preserve">测试片支持对Memory实例进行读写操作功能测试。</w:t>
+      </w:r>
+    </w:p>
     <w:bookmarkEnd w:id="53"/>
+    <w:bookmarkStart w:id="54" w:name="功耗测试-1"/>
+    <w:p>
+      <w:pPr>
+        <w:pStyle w:val="5"/>
+      </w:pPr>
+      <w:r>
+        <w:t xml:space="preserve">2.2.1.2 </w:t>
+      </w:r>
+      <w:r>
+        <w:rPr>
+          <w:rFonts w:hint="eastAsia"/>
+        </w:rPr>
+        <w:t xml:space="preserve">功耗测试</w:t>
+      </w:r>
+    </w:p>
+    <w:p>
+      <w:pPr>
+        <w:pStyle w:val="FirstParagraph"/>
+      </w:pPr>
+      <w:r>
+        <w:rPr>
+          <w:rFonts w:hint="eastAsia"/>
+        </w:rPr>
+        <w:t xml:space="preserve">测试片支持对Memory实例进行静态功耗、睡眠模式、动态功耗进行测试。</w:t>
+      </w:r>
+    </w:p>
     <w:bookmarkEnd w:id="54"/>
+    <w:bookmarkStart w:id="55" w:name="最高最低工作电压测试-1"/>
+    <w:p>
+      <w:pPr>
+        <w:pStyle w:val="5"/>
+      </w:pPr>
+      <w:r>
+        <w:t xml:space="preserve">2.2.1.3 </w:t>
+      </w:r>
+      <w:r>
+        <w:rPr>
+          <w:rFonts w:hint="eastAsia"/>
+        </w:rPr>
+        <w:t xml:space="preserve">最高最低工作电压测试</w:t>
+      </w:r>
+    </w:p>
+    <w:p>
+      <w:pPr>
+        <w:pStyle w:val="FirstParagraph"/>
+      </w:pPr>
+      <w:r>
+        <w:rPr>
+          <w:rFonts w:hint="eastAsia"/>
+        </w:rPr>
+        <w:t xml:space="preserve">测试片支持对SRAM多种工作电压进行测试，按照合理的电压步长进行最低和最高工作电压测试，测试需要得到读操作最低最高工作电压和写操作最低最高工作电压。</w:t>
+      </w:r>
+    </w:p>
+    <w:bookmarkEnd w:id="55"/>
+    <w:bookmarkStart w:id="56" w:name="retention测试-1"/>
+    <w:p>
+      <w:pPr>
+        <w:pStyle w:val="5"/>
+      </w:pPr>
+      <w:r>
+        <w:t xml:space="preserve">2.2.1.4 </w:t>
+      </w:r>
+      <w:r>
+        <w:rPr>
+          <w:rFonts w:hint="eastAsia"/>
+        </w:rPr>
+        <w:t xml:space="preserve">Retention测试</w:t>
+      </w:r>
+    </w:p>
+    <w:p>
+      <w:pPr>
+        <w:pStyle w:val="FirstParagraph"/>
+      </w:pPr>
+      <w:r>
+        <w:rPr>
+          <w:rFonts w:hint="eastAsia"/>
+        </w:rPr>
+        <w:t xml:space="preserve">测试片通过常压读写操作，随后Standby模式下降低sram供电电压，随后升高到常压进行读操作。</w:t>
+      </w:r>
+    </w:p>
+    <w:bookmarkEnd w:id="56"/>
+    <w:bookmarkStart w:id="57" w:name="htol测试-1"/>
+    <w:p>
+      <w:pPr>
+        <w:pStyle w:val="5"/>
+      </w:pPr>
+      <w:r>
+        <w:t xml:space="preserve">2.2.1.5 </w:t>
+      </w:r>
+      <w:r>
+        <w:rPr>
+          <w:rFonts w:hint="eastAsia"/>
+        </w:rPr>
+        <w:t xml:space="preserve">HTOL测试</w:t>
+      </w:r>
+    </w:p>
+    <w:p>
+      <w:pPr>
+        <w:pStyle w:val="FirstParagraph"/>
+      </w:pPr>
+      <w:r>
+        <w:rPr>
+          <w:rFonts w:hint="eastAsia"/>
+        </w:rPr>
+        <w:t xml:space="preserve">测试片支持SMarchCHKBvcd算法，并通过Mbist进行循环测试，用于提升HTOL测试效率，封装pad需要满足HTOL测试机台的要求。</w:t>
+      </w:r>
+    </w:p>
+    <w:bookmarkEnd w:id="57"/>
+    <w:bookmarkStart w:id="58" w:name="冗余功能测试"/>
+    <w:p>
+      <w:pPr>
+        <w:pStyle w:val="5"/>
+      </w:pPr>
+      <w:r>
+        <w:t xml:space="preserve">2.2.1.6 </w:t>
+      </w:r>
+      <w:r>
+        <w:rPr>
+          <w:rFonts w:hint="eastAsia"/>
+        </w:rPr>
+        <w:t xml:space="preserve">冗余功能测试</w:t>
+      </w:r>
+    </w:p>
+    <w:p>
+      <w:pPr>
+        <w:pStyle w:val="FirstParagraph"/>
+      </w:pPr>
+      <w:r>
+        <w:rPr>
+          <w:rFonts w:hint="eastAsia"/>
+        </w:rPr>
+        <w:t xml:space="preserve">测试片支持对冗余功能的Memory实例进行功能验证，测试片支持解析后的冗余配置信息对Memory实例的冗余DFF链进行配置，从而实现冗余替换功能。</w:t>
+      </w:r>
+    </w:p>
+    <w:bookmarkEnd w:id="58"/>
+    <w:bookmarkStart w:id="59" w:name="ecc功能测试"/>
+    <w:p>
+      <w:pPr>
+        <w:pStyle w:val="5"/>
+      </w:pPr>
+      <w:r>
+        <w:t xml:space="preserve">2.2.1.7 </w:t>
+      </w:r>
+      <w:r>
+        <w:rPr>
+          <w:rFonts w:hint="eastAsia"/>
+        </w:rPr>
+        <w:t xml:space="preserve">ECC功能测试</w:t>
+      </w:r>
+    </w:p>
+    <w:p>
+      <w:pPr>
+        <w:pStyle w:val="FirstParagraph"/>
+      </w:pPr>
+      <w:r>
+        <w:rPr>
+          <w:rFonts w:hint="eastAsia"/>
+        </w:rPr>
+        <w:t xml:space="preserve">测试片支持对SRAM的ECC功能进行验证，使用提供的实现ECC功能的RTL代码进行综合，并支持外部向量置错场景下的一位纠错以及两位检错的功能验证。</w:t>
+      </w:r>
+    </w:p>
+    <w:bookmarkEnd w:id="59"/>
+    <w:bookmarkStart w:id="60" w:name="mbist高速测试"/>
+    <w:p>
+      <w:pPr>
+        <w:pStyle w:val="5"/>
+      </w:pPr>
+      <w:r>
+        <w:t xml:space="preserve">2.2.1.8 </w:t>
+      </w:r>
+      <w:r>
+        <w:rPr>
+          <w:rFonts w:hint="eastAsia"/>
+        </w:rPr>
+        <w:t xml:space="preserve">MBIST高速测试</w:t>
+      </w:r>
+    </w:p>
+    <w:p>
+      <w:pPr>
+        <w:pStyle w:val="FirstParagraph"/>
+      </w:pPr>
+      <w:r>
+        <w:rPr>
+          <w:rFonts w:hint="eastAsia"/>
+        </w:rPr>
+        <w:t xml:space="preserve">测试片支持使用</w:t>
+      </w:r>
+      <w:r>
+        <w:t xml:space="preserve"> SMarchCHKBvcd </w:t>
+      </w:r>
+      <w:r>
+        <w:rPr>
+          <w:rFonts w:hint="eastAsia"/>
+        </w:rPr>
+        <w:t xml:space="preserve">算法对</w:t>
+      </w:r>
+      <w:r>
+        <w:t xml:space="preserve"> Memory Instance </w:t>
+      </w:r>
+      <w:r>
+        <w:rPr>
+          <w:rFonts w:hint="eastAsia"/>
+        </w:rPr>
+        <w:t xml:space="preserve">进行额定最高工作频率进行高速测试。请留意双端口SRAM</w:t>
+      </w:r>
+      <w:r>
+        <w:t xml:space="preserve"> </w:t>
+      </w:r>
+      <w:r>
+        <w:rPr>
+          <w:rFonts w:hint="eastAsia"/>
+        </w:rPr>
+        <w:t xml:space="preserve">仅进行同步时钟测试，且需要留意同地址操作在算法激励中的规避。</w:t>
+      </w:r>
+    </w:p>
+    <w:bookmarkEnd w:id="60"/>
+    <w:bookmarkStart w:id="61" w:name="时序测试"/>
+    <w:p>
+      <w:pPr>
+        <w:pStyle w:val="5"/>
+      </w:pPr>
+      <w:r>
+        <w:t xml:space="preserve">2.2.1.9 </w:t>
+      </w:r>
+      <w:r>
+        <w:rPr>
+          <w:rFonts w:hint="eastAsia"/>
+        </w:rPr>
+        <w:t xml:space="preserve">时序测试</w:t>
+      </w:r>
+    </w:p>
+    <w:p>
+      <w:pPr>
+        <w:pStyle w:val="FirstParagraph"/>
+      </w:pPr>
+      <w:r>
+        <w:rPr>
+          <w:rFonts w:hint="eastAsia"/>
+        </w:rPr>
+        <w:t xml:space="preserve">测试片支持对</w:t>
+      </w:r>
+      <w:r>
+        <w:t xml:space="preserve"> Memory </w:t>
+      </w:r>
+      <w:r>
+        <w:rPr>
+          <w:rFonts w:hint="eastAsia"/>
+        </w:rPr>
+        <w:t xml:space="preserve">实例的关键信号的建立时间、保持时间以及数据读出时间进行测量</w:t>
+      </w:r>
+    </w:p>
+    <w:bookmarkEnd w:id="61"/>
+    <w:bookmarkEnd w:id="62"/>
+    <w:bookmarkStart w:id="63" w:name="第二阶段测试片开发计划"/>
+    <w:p>
+      <w:pPr>
+        <w:pStyle w:val="4"/>
+      </w:pPr>
+      <w:r>
+        <w:t xml:space="preserve">2.2.2 </w:t>
+      </w:r>
+      <w:r>
+        <w:rPr>
+          <w:rFonts w:hint="eastAsia"/>
+        </w:rPr>
+        <w:t xml:space="preserve">第二阶段测试片开发计划</w:t>
+      </w:r>
+    </w:p>
+    <w:p>
+      <w:pPr>
+        <w:pStyle w:val="TableCaption"/>
+      </w:pPr>
+      <w:r>
+        <w:rPr>
+          <w:rFonts w:hint="eastAsia"/>
+          <w:b/>
+          <w:bCs/>
+        </w:rPr>
+        <w:t xml:space="preserve">表</w:t>
+      </w:r>
+      <w:r>
+        <w:rPr>
+          <w:b/>
+          <w:bCs/>
+        </w:rPr>
+        <w:t xml:space="preserve"> 2-5 </w:t>
+      </w:r>
+      <w:r>
+        <w:rPr>
+          <w:rFonts w:hint="eastAsia"/>
+          <w:b/>
+          <w:bCs/>
+        </w:rPr>
+        <w:t xml:space="preserve">第二阶段测试片开发计划</w:t>
+      </w:r>
+    </w:p>
+    <w:tbl>
+      <w:tblPr>
+        <w:tblStyle w:val="Table"/>
+        <w:tblW w:type="pct" w:w="4867"/>
+        <w:tblLayout w:type="fixed"/>
+        <w:tblLook w:firstRow="1" w:lastRow="0" w:firstColumn="0" w:lastColumn="0" w:noHBand="0" w:noVBand="0" w:val="0020"/>
+        <w:tblCaption w:val="表 2-5 第二阶段测试片开发计划"/>
+      </w:tblPr>
+      <w:tblGrid>
+        <w:gridCol w:w="1056"/>
+        <w:gridCol w:w="3696"/>
+        <w:gridCol w:w="1584"/>
+        <w:gridCol w:w="1372"/>
+      </w:tblGrid>
+      <w:tr>
+        <w:trPr>
+          <w:tblHeader w:val="on"/>
+        </w:trPr>
+        <w:tc>
+          <w:tcPr/>
+          <w:p>
+            <w:pPr>
+              <w:pStyle w:val="Compact"/>
+            </w:pPr>
+            <w:r>
+              <w:t xml:space="preserve">Phase</w:t>
+            </w:r>
+          </w:p>
+        </w:tc>
+        <w:tc>
+          <w:tcPr/>
+          <w:p>
+            <w:pPr>
+              <w:pStyle w:val="Compact"/>
+            </w:pPr>
+            <w:r>
+              <w:t xml:space="preserve">Task</w:t>
+            </w:r>
+          </w:p>
+        </w:tc>
+        <w:tc>
+          <w:tcPr/>
+          <w:p>
+            <w:pPr>
+              <w:pStyle w:val="Compact"/>
+            </w:pPr>
+            <w:r>
+              <w:t xml:space="preserve">Start Date</w:t>
+            </w:r>
+          </w:p>
+        </w:tc>
+        <w:tc>
+          <w:tcPr/>
+          <w:p>
+            <w:pPr>
+              <w:pStyle w:val="Compact"/>
+            </w:pPr>
+            <w:r>
+              <w:t xml:space="preserve">End Date</w:t>
+            </w:r>
+          </w:p>
+        </w:tc>
+      </w:tr>
+      <w:tr>
+        <w:tc>
+          <w:tcPr/>
+          <w:p>
+            <w:pPr>
+              <w:pStyle w:val="Compact"/>
+            </w:pPr>
+            <w:r>
+              <w:t xml:space="preserve">1</w:t>
+            </w:r>
+          </w:p>
+        </w:tc>
+        <w:tc>
+          <w:tcPr/>
+          <w:p>
+            <w:pPr>
+              <w:pStyle w:val="Compact"/>
+            </w:pPr>
+            <w:r>
+              <w:t xml:space="preserve">KICK OFF</w:t>
+            </w:r>
+          </w:p>
+        </w:tc>
+        <w:tc>
+          <w:tcPr/>
+          <w:p>
+            <w:pPr>
+              <w:pStyle w:val="Compact"/>
+            </w:pPr>
+            <w:r>
+              <w:t xml:space="preserve">2026/12/1</w:t>
+            </w:r>
+          </w:p>
+        </w:tc>
+        <w:tc>
+          <w:tcPr/>
+          <w:p>
+            <w:pPr>
+              <w:pStyle w:val="Compact"/>
+            </w:pPr>
+            <w:r>
+              <w:t xml:space="preserve">2026/12/05</w:t>
+            </w:r>
+          </w:p>
+        </w:tc>
+      </w:tr>
+      <w:tr>
+        <w:tc>
+          <w:tcPr/>
+          <w:p>
+            <w:pPr>
+              <w:pStyle w:val="Compact"/>
+            </w:pPr>
+            <w:r>
+              <w:t xml:space="preserve">2</w:t>
+            </w:r>
+          </w:p>
+        </w:tc>
+        <w:tc>
+          <w:tcPr/>
+          <w:p>
+            <w:pPr>
+              <w:pStyle w:val="Compact"/>
+            </w:pPr>
+            <w:r>
+              <w:t xml:space="preserve">SRAM Compiler IP Initial Release</w:t>
+            </w:r>
+          </w:p>
+        </w:tc>
+        <w:tc>
+          <w:tcPr/>
+          <w:p>
+            <w:pPr>
+              <w:pStyle w:val="Compact"/>
+            </w:pPr>
+            <w:r>
+              <w:t xml:space="preserve">2026/12/15</w:t>
+            </w:r>
+          </w:p>
+        </w:tc>
+        <w:tc>
+          <w:tcPr/>
+          <w:p>
+            <w:pPr>
+              <w:pStyle w:val="Compact"/>
+            </w:pPr>
+            <w:r>
+              <w:t xml:space="preserve">2026/12/20</w:t>
+            </w:r>
+          </w:p>
+        </w:tc>
+      </w:tr>
+      <w:tr>
+        <w:tc>
+          <w:tcPr/>
+          <w:p>
+            <w:pPr>
+              <w:pStyle w:val="Compact"/>
+            </w:pPr>
+            <w:r>
+              <w:t xml:space="preserve">3</w:t>
+            </w:r>
+          </w:p>
+        </w:tc>
+        <w:tc>
+          <w:tcPr/>
+          <w:p>
+            <w:pPr>
+              <w:pStyle w:val="Compact"/>
+            </w:pPr>
+            <w:r>
+              <w:t xml:space="preserve">RTL Design &amp; Simulation</w:t>
+            </w:r>
+          </w:p>
+        </w:tc>
+        <w:tc>
+          <w:tcPr/>
+          <w:p>
+            <w:pPr>
+              <w:pStyle w:val="Compact"/>
+            </w:pPr>
+            <w:r>
+              <w:t xml:space="preserve">2026/12/01</w:t>
+            </w:r>
+          </w:p>
+        </w:tc>
+        <w:tc>
+          <w:tcPr/>
+          <w:p>
+            <w:pPr>
+              <w:pStyle w:val="Compact"/>
+            </w:pPr>
+            <w:r>
+              <w:t xml:space="preserve">2027/1/31</w:t>
+            </w:r>
+          </w:p>
+        </w:tc>
+      </w:tr>
+      <w:tr>
+        <w:tc>
+          <w:tcPr/>
+          <w:p>
+            <w:pPr>
+              <w:pStyle w:val="Compact"/>
+            </w:pPr>
+            <w:r>
+              <w:t xml:space="preserve">4</w:t>
+            </w:r>
+          </w:p>
+        </w:tc>
+        <w:tc>
+          <w:tcPr/>
+          <w:p>
+            <w:pPr>
+              <w:pStyle w:val="Compact"/>
+            </w:pPr>
+            <w:r>
+              <w:t xml:space="preserve">Verification</w:t>
+            </w:r>
+          </w:p>
+        </w:tc>
+        <w:tc>
+          <w:tcPr/>
+          <w:p>
+            <w:pPr>
+              <w:pStyle w:val="Compact"/>
+            </w:pPr>
+            <w:r>
+              <w:t xml:space="preserve">2027/1/15</w:t>
+            </w:r>
+          </w:p>
+        </w:tc>
+        <w:tc>
+          <w:tcPr/>
+          <w:p>
+            <w:pPr>
+              <w:pStyle w:val="Compact"/>
+            </w:pPr>
+            <w:r>
+              <w:t xml:space="preserve">2027/2/15</w:t>
+            </w:r>
+          </w:p>
+        </w:tc>
+      </w:tr>
+      <w:tr>
+        <w:tc>
+          <w:tcPr/>
+          <w:p>
+            <w:pPr>
+              <w:pStyle w:val="Compact"/>
+            </w:pPr>
+            <w:r>
+              <w:t xml:space="preserve">5</w:t>
+            </w:r>
+          </w:p>
+        </w:tc>
+        <w:tc>
+          <w:tcPr/>
+          <w:p>
+            <w:pPr>
+              <w:pStyle w:val="Compact"/>
+            </w:pPr>
+            <w:r>
+              <w:t xml:space="preserve">SRAM Compiler IP Final Release</w:t>
+            </w:r>
+          </w:p>
+        </w:tc>
+        <w:tc>
+          <w:tcPr/>
+          <w:p>
+            <w:pPr>
+              <w:pStyle w:val="Compact"/>
+            </w:pPr>
+            <w:r>
+              <w:t xml:space="preserve">2027/3/15</w:t>
+            </w:r>
+          </w:p>
+        </w:tc>
+        <w:tc>
+          <w:tcPr/>
+          <w:p>
+            <w:pPr>
+              <w:pStyle w:val="Compact"/>
+            </w:pPr>
+            <w:r>
+              <w:t xml:space="preserve">2027/3/20</w:t>
+            </w:r>
+          </w:p>
+        </w:tc>
+      </w:tr>
+      <w:tr>
+        <w:tc>
+          <w:tcPr/>
+          <w:p>
+            <w:pPr>
+              <w:pStyle w:val="Compact"/>
+            </w:pPr>
+            <w:r>
+              <w:t xml:space="preserve">6</w:t>
+            </w:r>
+          </w:p>
+        </w:tc>
+        <w:tc>
+          <w:tcPr/>
+          <w:p>
+            <w:pPr>
+              <w:pStyle w:val="Compact"/>
+            </w:pPr>
+            <w:r>
+              <w:t xml:space="preserve">PR</w:t>
+            </w:r>
+          </w:p>
+        </w:tc>
+        <w:tc>
+          <w:tcPr/>
+          <w:p>
+            <w:pPr>
+              <w:pStyle w:val="Compact"/>
+            </w:pPr>
+            <w:r>
+              <w:t xml:space="preserve">2027/3/1</w:t>
+            </w:r>
+          </w:p>
+        </w:tc>
+        <w:tc>
+          <w:tcPr/>
+          <w:p>
+            <w:pPr>
+              <w:pStyle w:val="Compact"/>
+            </w:pPr>
+            <w:r>
+              <w:t xml:space="preserve">2027/6/1</w:t>
+            </w:r>
+          </w:p>
+        </w:tc>
+      </w:tr>
+      <w:tr>
+        <w:tc>
+          <w:tcPr/>
+          <w:p>
+            <w:pPr>
+              <w:pStyle w:val="Compact"/>
+            </w:pPr>
+            <w:r>
+              <w:t xml:space="preserve">7</w:t>
+            </w:r>
+          </w:p>
+        </w:tc>
+        <w:tc>
+          <w:tcPr/>
+          <w:p>
+            <w:pPr>
+              <w:pStyle w:val="Compact"/>
+            </w:pPr>
+            <w:r>
+              <w:t xml:space="preserve">Post-Simulation</w:t>
+            </w:r>
+          </w:p>
+        </w:tc>
+        <w:tc>
+          <w:tcPr/>
+          <w:p>
+            <w:pPr>
+              <w:pStyle w:val="Compact"/>
+            </w:pPr>
+            <w:r>
+              <w:t xml:space="preserve">2027/6/1</w:t>
+            </w:r>
+          </w:p>
+        </w:tc>
+        <w:tc>
+          <w:tcPr/>
+          <w:p>
+            <w:pPr>
+              <w:pStyle w:val="Compact"/>
+            </w:pPr>
+            <w:r>
+              <w:t xml:space="preserve">2027/6/15</w:t>
+            </w:r>
+          </w:p>
+        </w:tc>
+      </w:tr>
+      <w:tr>
+        <w:tc>
+          <w:tcPr/>
+          <w:p>
+            <w:pPr>
+              <w:pStyle w:val="Compact"/>
+            </w:pPr>
+            <w:r>
+              <w:t xml:space="preserve">8</w:t>
+            </w:r>
+          </w:p>
+        </w:tc>
+        <w:tc>
+          <w:tcPr/>
+          <w:p>
+            <w:pPr>
+              <w:pStyle w:val="Compact"/>
+            </w:pPr>
+            <w:r>
+              <w:t xml:space="preserve">Sign off</w:t>
+            </w:r>
+          </w:p>
+        </w:tc>
+        <w:tc>
+          <w:tcPr/>
+          <w:p>
+            <w:pPr>
+              <w:pStyle w:val="Compact"/>
+            </w:pPr>
+            <w:r>
+              <w:t xml:space="preserve">2027/6/15</w:t>
+            </w:r>
+          </w:p>
+        </w:tc>
+        <w:tc>
+          <w:tcPr/>
+          <w:p>
+            <w:pPr>
+              <w:pStyle w:val="Compact"/>
+            </w:pPr>
+            <w:r>
+              <w:t xml:space="preserve">2027/6/25</w:t>
+            </w:r>
+          </w:p>
+        </w:tc>
+      </w:tr>
+      <w:tr>
+        <w:tc>
+          <w:tcPr/>
+          <w:p>
+            <w:pPr>
+              <w:pStyle w:val="Compact"/>
+            </w:pPr>
+            <w:r>
+              <w:t xml:space="preserve">9</w:t>
+            </w:r>
+          </w:p>
+        </w:tc>
+        <w:tc>
+          <w:tcPr/>
+          <w:p>
+            <w:pPr>
+              <w:pStyle w:val="Compact"/>
+            </w:pPr>
+            <w:r>
+              <w:t xml:space="preserve">Tape out</w:t>
+            </w:r>
+          </w:p>
+        </w:tc>
+        <w:tc>
+          <w:tcPr/>
+          <w:p>
+            <w:pPr>
+              <w:pStyle w:val="Compact"/>
+            </w:pPr>
+            <w:r>
+              <w:t xml:space="preserve">2027/6/25</w:t>
+            </w:r>
+          </w:p>
+        </w:tc>
+        <w:tc>
+          <w:tcPr/>
+          <w:p>
+            <w:pPr>
+              <w:pStyle w:val="Compact"/>
+            </w:pPr>
+            <w:r>
+              <w:t xml:space="preserve">2027/6/30</w:t>
+            </w:r>
+          </w:p>
+        </w:tc>
+      </w:tr>
+    </w:tbl>
+    <w:bookmarkEnd w:id="63"/>
+    <w:bookmarkStart w:id="64" w:name="第二阶段封装测试计划"/>
+    <w:p>
+      <w:pPr>
+        <w:pStyle w:val="4"/>
+      </w:pPr>
+      <w:r>
+        <w:t xml:space="preserve">2.2.3 </w:t>
+      </w:r>
+      <w:r>
+        <w:rPr>
+          <w:rFonts w:hint="eastAsia"/>
+        </w:rPr>
+        <w:t xml:space="preserve">第二阶段封装测试计划</w:t>
+      </w:r>
+    </w:p>
+    <w:p>
+      <w:pPr>
+        <w:pStyle w:val="TableCaption"/>
+      </w:pPr>
+      <w:r>
+        <w:rPr>
+          <w:rFonts w:hint="eastAsia"/>
+          <w:b/>
+          <w:bCs/>
+        </w:rPr>
+        <w:t xml:space="preserve">表</w:t>
+      </w:r>
+      <w:r>
+        <w:rPr>
+          <w:b/>
+          <w:bCs/>
+        </w:rPr>
+        <w:t xml:space="preserve"> 2-6 </w:t>
+      </w:r>
+      <w:r>
+        <w:rPr>
+          <w:rFonts w:hint="eastAsia"/>
+          <w:b/>
+          <w:bCs/>
+        </w:rPr>
+        <w:t xml:space="preserve">第二阶段封装测试计划</w:t>
+      </w:r>
+    </w:p>
+    <w:tbl>
+      <w:tblPr>
+        <w:tblStyle w:val="Table"/>
+        <w:tblW w:type="pct" w:w="3125"/>
+        <w:tblLayout w:type="fixed"/>
+        <w:tblLook w:firstRow="1" w:lastRow="0" w:firstColumn="0" w:lastColumn="0" w:noHBand="0" w:noVBand="0" w:val="0020"/>
+        <w:tblCaption w:val="表 2-6 第二阶段封装测试计划"/>
+      </w:tblPr>
+      <w:tblGrid>
+        <w:gridCol w:w="1100"/>
+        <w:gridCol w:w="1980"/>
+        <w:gridCol w:w="1870"/>
+      </w:tblGrid>
+      <w:tr>
+        <w:trPr>
+          <w:tblHeader w:val="on"/>
+        </w:trPr>
+        <w:tc>
+          <w:tcPr/>
+          <w:p>
+            <w:pPr>
+              <w:pStyle w:val="Compact"/>
+            </w:pPr>
+            <w:r>
+              <w:t xml:space="preserve">Phase</w:t>
+            </w:r>
+          </w:p>
+        </w:tc>
+        <w:tc>
+          <w:tcPr/>
+          <w:p>
+            <w:pPr>
+              <w:pStyle w:val="Compact"/>
+            </w:pPr>
+            <w:r>
+              <w:t xml:space="preserve">Task</w:t>
+            </w:r>
+          </w:p>
+        </w:tc>
+        <w:tc>
+          <w:tcPr/>
+          <w:p>
+            <w:pPr>
+              <w:pStyle w:val="Compact"/>
+            </w:pPr>
+            <w:r>
+              <w:t xml:space="preserve">Date</w:t>
+            </w:r>
+          </w:p>
+        </w:tc>
+      </w:tr>
+      <w:tr>
+        <w:tc>
+          <w:tcPr/>
+          <w:p>
+            <w:pPr>
+              <w:pStyle w:val="Compact"/>
+            </w:pPr>
+            <w:r>
+              <w:t xml:space="preserve">1</w:t>
+            </w:r>
+          </w:p>
+        </w:tc>
+        <w:tc>
+          <w:tcPr/>
+          <w:p>
+            <w:pPr>
+              <w:pStyle w:val="Compact"/>
+            </w:pPr>
+            <w:r>
+              <w:t xml:space="preserve">Wafer out</w:t>
+            </w:r>
+          </w:p>
+        </w:tc>
+        <w:tc>
+          <w:tcPr/>
+          <w:p>
+            <w:pPr>
+              <w:pStyle w:val="Compact"/>
+            </w:pPr>
+            <w:r>
+              <w:t xml:space="preserve">T0</w:t>
+            </w:r>
+          </w:p>
+        </w:tc>
+      </w:tr>
+      <w:tr>
+        <w:tc>
+          <w:tcPr/>
+          <w:p>
+            <w:pPr>
+              <w:pStyle w:val="Compact"/>
+            </w:pPr>
+            <w:r>
+              <w:t xml:space="preserve">2</w:t>
+            </w:r>
+          </w:p>
+        </w:tc>
+        <w:tc>
+          <w:tcPr/>
+          <w:p>
+            <w:pPr>
+              <w:pStyle w:val="Compact"/>
+            </w:pPr>
+            <w:r>
+              <w:t xml:space="preserve">Testchip</w:t>
+            </w:r>
+            <w:r>
+              <w:t xml:space="preserve"> </w:t>
+            </w:r>
+            <w:r>
+              <w:t xml:space="preserve">Package</w:t>
+            </w:r>
+          </w:p>
+        </w:tc>
+        <w:tc>
+          <w:tcPr/>
+          <w:p>
+            <w:pPr>
+              <w:pStyle w:val="Compact"/>
+            </w:pPr>
+            <w:r>
+              <w:t xml:space="preserve">T0 + 1.5 month</w:t>
+            </w:r>
+          </w:p>
+        </w:tc>
+      </w:tr>
+      <w:tr>
+        <w:tc>
+          <w:tcPr/>
+          <w:p>
+            <w:pPr>
+              <w:pStyle w:val="Compact"/>
+            </w:pPr>
+            <w:r>
+              <w:t xml:space="preserve">3</w:t>
+            </w:r>
+          </w:p>
+        </w:tc>
+        <w:tc>
+          <w:tcPr/>
+          <w:p>
+            <w:pPr>
+              <w:pStyle w:val="Compact"/>
+            </w:pPr>
+            <w:r>
+              <w:t xml:space="preserve">Testchip</w:t>
+            </w:r>
+            <w:r>
+              <w:t xml:space="preserve"> </w:t>
+            </w:r>
+            <w:r>
+              <w:t xml:space="preserve">Loadboard</w:t>
+            </w:r>
+          </w:p>
+        </w:tc>
+        <w:tc>
+          <w:tcPr/>
+          <w:p>
+            <w:pPr>
+              <w:pStyle w:val="Compact"/>
+            </w:pPr>
+            <w:r>
+              <w:t xml:space="preserve">T0 + 2 month</w:t>
+            </w:r>
+          </w:p>
+        </w:tc>
+      </w:tr>
+      <w:tr>
+        <w:tc>
+          <w:tcPr/>
+          <w:p>
+            <w:pPr>
+              <w:pStyle w:val="Compact"/>
+            </w:pPr>
+            <w:r>
+              <w:t xml:space="preserve">4</w:t>
+            </w:r>
+          </w:p>
+        </w:tc>
+        <w:tc>
+          <w:tcPr/>
+          <w:p>
+            <w:pPr>
+              <w:pStyle w:val="Compact"/>
+            </w:pPr>
+            <w:r>
+              <w:t xml:space="preserve">Testchip Test</w:t>
+            </w:r>
+          </w:p>
+        </w:tc>
+        <w:tc>
+          <w:tcPr/>
+          <w:p>
+            <w:pPr>
+              <w:pStyle w:val="Compact"/>
+            </w:pPr>
+            <w:r>
+              <w:t xml:space="preserve">T0 + 3.5 month</w:t>
+            </w:r>
+          </w:p>
+        </w:tc>
+      </w:tr>
+      <w:tr>
+        <w:tc>
+          <w:tcPr/>
+          <w:p>
+            <w:pPr>
+              <w:pStyle w:val="Compact"/>
+            </w:pPr>
+            <w:r>
+              <w:t xml:space="preserve">5</w:t>
+            </w:r>
+          </w:p>
+        </w:tc>
+        <w:tc>
+          <w:tcPr/>
+          <w:p>
+            <w:pPr>
+              <w:pStyle w:val="Compact"/>
+            </w:pPr>
+            <w:r>
+              <w:t xml:space="preserve">Testchip Report</w:t>
+            </w:r>
+          </w:p>
+        </w:tc>
+        <w:tc>
+          <w:tcPr/>
+          <w:p>
+            <w:pPr>
+              <w:pStyle w:val="Compact"/>
+            </w:pPr>
+            <w:r>
+              <w:t xml:space="preserve">T0 + 3.5 month</w:t>
+            </w:r>
+          </w:p>
+        </w:tc>
+      </w:tr>
+    </w:tbl>
+    <w:bookmarkEnd w:id="64"/>
+    <w:bookmarkEnd w:id="65"/>
+    <w:bookmarkEnd w:id="66"/>
     <w:sectPr>
       <w:headerReference r:id="rId8" w:type="even"/>
       <w:headerReference r:id="rId9" w:type="default"/>

</xml_diff>